<commit_message>
finish design of arctic wolf cc aside from image
</commit_message>
<xml_diff>
--- a/Arbeitsjournal Maturarbeit.docx
+++ b/Arbeitsjournal Maturarbeit.docx
@@ -6,44 +6,47 @@
       <w:pPr>
         <w:rPr>
           <w:rFonts w:ascii="Courier New" w:hAnsi="Courier New" w:cs="Courier New"/>
-          <w:lang w:val="en-US"/>
-        </w:rPr>
-      </w:pPr>
-      <w:proofErr w:type="spellStart"/>
-      <w:r>
-        <w:rPr>
-          <w:rFonts w:ascii="Courier New" w:hAnsi="Courier New" w:cs="Courier New"/>
-          <w:lang w:val="en-US"/>
-        </w:rPr>
-        <w:t>Arbeitsjournal</w:t>
-      </w:r>
-      <w:proofErr w:type="spellEnd"/>
-      <w:r>
-        <w:rPr>
-          <w:rFonts w:ascii="Courier New" w:hAnsi="Courier New" w:cs="Courier New"/>
-          <w:lang w:val="en-US"/>
-        </w:rPr>
-        <w:t xml:space="preserve"> Maturarbeit</w:t>
-      </w:r>
-    </w:p>
-    <w:p>
-      <w:pPr>
-        <w:rPr>
-          <w:rFonts w:ascii="Courier New" w:hAnsi="Courier New" w:cs="Courier New"/>
-          <w:lang w:val="en-US"/>
-        </w:rPr>
-      </w:pPr>
-    </w:p>
-    <w:p>
-      <w:pPr>
-        <w:rPr>
-          <w:rFonts w:ascii="Courier New" w:hAnsi="Courier New" w:cs="Courier New"/>
-          <w:lang w:val="en-US"/>
-        </w:rPr>
-      </w:pPr>
-      <w:r>
-        <w:rPr>
-          <w:rFonts w:ascii="Courier New" w:hAnsi="Courier New" w:cs="Courier New"/>
+          <w:b/>
+          <w:bCs/>
+          <w:u w:val="single"/>
+          <w:lang w:val="en-US"/>
+        </w:rPr>
+      </w:pPr>
+      <w:r>
+        <w:rPr>
+          <w:rFonts w:ascii="Courier New" w:hAnsi="Courier New" w:cs="Courier New"/>
+          <w:b/>
+          <w:bCs/>
+          <w:u w:val="single"/>
+          <w:lang w:val="en-US"/>
+        </w:rPr>
+        <w:t>Arbeitsjournal Maturarbeit</w:t>
+      </w:r>
+    </w:p>
+    <w:p>
+      <w:pPr>
+        <w:rPr>
+          <w:rFonts w:ascii="Courier New" w:hAnsi="Courier New" w:cs="Courier New"/>
+          <w:b/>
+          <w:bCs/>
+          <w:lang w:val="en-US"/>
+        </w:rPr>
+      </w:pPr>
+    </w:p>
+    <w:p>
+      <w:pPr>
+        <w:rPr>
+          <w:rFonts w:ascii="Courier New" w:hAnsi="Courier New" w:cs="Courier New"/>
+          <w:b/>
+          <w:bCs/>
+          <w:lang w:val="en-US"/>
+        </w:rPr>
+      </w:pPr>
+      <w:r>
+        <w:rPr>
+          <w:rFonts w:ascii="Courier New" w:hAnsi="Courier New" w:cs="Courier New"/>
+          <w:b/>
+          <w:bCs/>
           <w:lang w:val="en-US"/>
         </w:rPr>
         <w:t>2026_01_15:</w:t>
@@ -234,12 +237,16 @@
       <w:pPr>
         <w:rPr>
           <w:rFonts w:ascii="Courier New" w:hAnsi="Courier New" w:cs="Courier New"/>
-          <w:lang w:val="en-US"/>
-        </w:rPr>
-      </w:pPr>
-      <w:r>
-        <w:rPr>
-          <w:rFonts w:ascii="Courier New" w:hAnsi="Courier New" w:cs="Courier New"/>
+          <w:b/>
+          <w:bCs/>
+          <w:lang w:val="en-US"/>
+        </w:rPr>
+      </w:pPr>
+      <w:r>
+        <w:rPr>
+          <w:rFonts w:ascii="Courier New" w:hAnsi="Courier New" w:cs="Courier New"/>
+          <w:b/>
+          <w:bCs/>
           <w:lang w:val="en-US"/>
         </w:rPr>
         <w:t>2026_02_23:</w:t>
@@ -287,12 +294,16 @@
       <w:pPr>
         <w:rPr>
           <w:rFonts w:ascii="Courier New" w:hAnsi="Courier New" w:cs="Courier New"/>
-          <w:lang w:val="en-US"/>
-        </w:rPr>
-      </w:pPr>
-      <w:r>
-        <w:rPr>
-          <w:rFonts w:ascii="Courier New" w:hAnsi="Courier New" w:cs="Courier New"/>
+          <w:b/>
+          <w:bCs/>
+          <w:lang w:val="en-US"/>
+        </w:rPr>
+      </w:pPr>
+      <w:r>
+        <w:rPr>
+          <w:rFonts w:ascii="Courier New" w:hAnsi="Courier New" w:cs="Courier New"/>
+          <w:b/>
+          <w:bCs/>
           <w:lang w:val="en-US"/>
         </w:rPr>
         <w:t>2026_02_24:</w:t>
@@ -357,6 +368,71 @@
           <w:lang w:val="en-US"/>
         </w:rPr>
       </w:pPr>
+      <w:r>
+        <w:rPr>
+          <w:rFonts w:ascii="Courier New" w:hAnsi="Courier New" w:cs="Courier New"/>
+          <w:lang w:val="en-US"/>
+        </w:rPr>
+        <w:t xml:space="preserve">Finish </w:t>
+      </w:r>
+      <w:r>
+        <w:rPr>
+          <w:rFonts w:ascii="Courier New" w:hAnsi="Courier New" w:cs="Courier New"/>
+          <w:lang w:val="en-US"/>
+        </w:rPr>
+        <w:t>Blueprint of Character Cards</w:t>
+      </w:r>
+      <w:r>
+        <w:rPr>
+          <w:rFonts w:ascii="Courier New" w:hAnsi="Courier New" w:cs="Courier New"/>
+          <w:lang w:val="en-US"/>
+        </w:rPr>
+        <w:t xml:space="preserve"> (henceforth “CCs”)</w:t>
+      </w:r>
+    </w:p>
+    <w:p>
+      <w:pPr>
+        <w:rPr>
+          <w:rFonts w:ascii="Courier New" w:hAnsi="Courier New" w:cs="Courier New"/>
+          <w:b/>
+          <w:bCs/>
+          <w:lang w:val="en-US"/>
+        </w:rPr>
+      </w:pPr>
+    </w:p>
+    <w:p>
+      <w:pPr>
+        <w:rPr>
+          <w:rFonts w:ascii="Courier New" w:hAnsi="Courier New" w:cs="Courier New"/>
+          <w:b/>
+          <w:bCs/>
+          <w:lang w:val="en-US"/>
+        </w:rPr>
+      </w:pPr>
+      <w:r>
+        <w:rPr>
+          <w:rFonts w:ascii="Courier New" w:hAnsi="Courier New" w:cs="Courier New"/>
+          <w:b/>
+          <w:bCs/>
+          <w:lang w:val="en-US"/>
+        </w:rPr>
+        <w:t>2026_02_25:</w:t>
+      </w:r>
+    </w:p>
+    <w:p>
+      <w:pPr>
+        <w:rPr>
+          <w:rFonts w:ascii="Courier New" w:hAnsi="Courier New" w:cs="Courier New"/>
+          <w:lang w:val="en-US"/>
+        </w:rPr>
+      </w:pPr>
+      <w:r>
+        <w:rPr>
+          <w:rFonts w:ascii="Courier New" w:hAnsi="Courier New" w:cs="Courier New"/>
+          <w:lang w:val="en-US"/>
+        </w:rPr>
+        <w:t>Finish design of Arctic Wolf CC aside from image</w:t>
+      </w:r>
     </w:p>
     <w:p>
       <w:pPr>

</xml_diff>

<commit_message>
start work on bear cc
</commit_message>
<xml_diff>
--- a/Arbeitsjournal Maturarbeit.docx
+++ b/Arbeitsjournal Maturarbeit.docx
@@ -12,6 +12,7 @@
           <w:lang w:val="en-US"/>
         </w:rPr>
       </w:pPr>
+      <w:proofErr w:type="spellStart"/>
       <w:r>
         <w:rPr>
           <w:rFonts w:ascii="Courier New" w:hAnsi="Courier New" w:cs="Courier New"/>
@@ -20,7 +21,18 @@
           <w:u w:val="single"/>
           <w:lang w:val="en-US"/>
         </w:rPr>
-        <w:t>Arbeitsjournal Maturarbeit</w:t>
+        <w:t>Arbeitsjournal</w:t>
+      </w:r>
+      <w:proofErr w:type="spellEnd"/>
+      <w:r>
+        <w:rPr>
+          <w:rFonts w:ascii="Courier New" w:hAnsi="Courier New" w:cs="Courier New"/>
+          <w:b/>
+          <w:bCs/>
+          <w:u w:val="single"/>
+          <w:lang w:val="en-US"/>
+        </w:rPr>
+        <w:t xml:space="preserve"> Maturarbeit</w:t>
       </w:r>
     </w:p>
     <w:p>
@@ -444,7 +456,55 @@
     </w:p>
     <w:p>
       <w:pPr>
-        <w:pStyle w:val="ListParagraph"/>
+        <w:rPr>
+          <w:rFonts w:ascii="Courier New" w:hAnsi="Courier New" w:cs="Courier New"/>
+          <w:b/>
+          <w:bCs/>
+          <w:lang w:val="en-US"/>
+        </w:rPr>
+      </w:pPr>
+      <w:r>
+        <w:rPr>
+          <w:rFonts w:ascii="Courier New" w:hAnsi="Courier New" w:cs="Courier New"/>
+          <w:b/>
+          <w:bCs/>
+          <w:lang w:val="en-US"/>
+        </w:rPr>
+        <w:t>2026_02_26:</w:t>
+      </w:r>
+    </w:p>
+    <w:p>
+      <w:pPr>
+        <w:rPr>
+          <w:rFonts w:ascii="Courier New" w:hAnsi="Courier New" w:cs="Courier New"/>
+          <w:lang w:val="en-US"/>
+        </w:rPr>
+      </w:pPr>
+      <w:r>
+        <w:rPr>
+          <w:rFonts w:ascii="Courier New" w:hAnsi="Courier New" w:cs="Courier New"/>
+          <w:lang w:val="en-US"/>
+        </w:rPr>
+        <w:t>Pruned list of characters down to 45 instead of 78.</w:t>
+      </w:r>
+    </w:p>
+    <w:p>
+      <w:pPr>
+        <w:rPr>
+          <w:rFonts w:ascii="Courier New" w:hAnsi="Courier New" w:cs="Courier New"/>
+          <w:lang w:val="en-US"/>
+        </w:rPr>
+      </w:pPr>
+      <w:r>
+        <w:rPr>
+          <w:rFonts w:ascii="Courier New" w:hAnsi="Courier New" w:cs="Courier New"/>
+          <w:lang w:val="en-US"/>
+        </w:rPr>
+        <w:t>Started design for Bear CC</w:t>
+      </w:r>
+    </w:p>
+    <w:p>
+      <w:pPr>
         <w:rPr>
           <w:rFonts w:ascii="Courier New" w:hAnsi="Courier New" w:cs="Courier New"/>
           <w:lang w:val="en-US"/>

</xml_diff>